<commit_message>
Updated Reporting, population estimates (Chapman with -1) and CI using recapr library.
</commit_message>
<xml_diff>
--- a/BackwaterEventSummary.docx
+++ b/BackwaterEventSummary.docx
@@ -31,7 +31,7 @@
         <w:pStyle w:val="Date"/>
       </w:pPr>
       <w:r>
-        <w:t xml:space="preserve">2026-05-27</w:t>
+        <w:t xml:space="preserve">2026-08-07</w:t>
       </w:r>
     </w:p>
     <w:sdt>
@@ -3252,7 +3252,7 @@
       </w:tblGrid>
       <w:tr>
         <w:trPr>
-          <w:trHeight w:val="574" w:hRule="auto"/>
+          <w:trHeight w:val="623" w:hRule="auto"/>
           <w:tblHeader/>
         </w:trPr>
         <w:tc>
@@ -3368,7 +3368,7 @@
       </w:tr>
       <w:tr>
         <w:trPr>
-          <w:trHeight w:val="574" w:hRule="auto"/>
+          <w:trHeight w:val="623" w:hRule="auto"/>
           <w:tblHeader/>
         </w:trPr>
         <w:tc>
@@ -3698,7 +3698,7 @@
       </w:tr>
       <w:tr>
         <w:trPr>
-          <w:trHeight w:val="572" w:hRule="auto"/>
+          <w:trHeight w:val="608" w:hRule="auto"/>
         </w:trPr>
         <w:tc>
           <w:tcPr>
@@ -4027,7 +4027,7 @@
       </w:tr>
       <w:tr>
         <w:trPr>
-          <w:trHeight w:val="571" w:hRule="auto"/>
+          <w:trHeight w:val="623" w:hRule="auto"/>
         </w:trPr>
         <w:tc>
           <w:tcPr>
@@ -4381,7 +4381,7 @@
       </w:tblGrid>
       <w:tr>
         <w:trPr>
-          <w:trHeight w:val="617" w:hRule="auto"/>
+          <w:trHeight w:val="623" w:hRule="auto"/>
           <w:tblHeader/>
         </w:trPr>
         <w:tc>
@@ -4552,7 +4552,7 @@
       </w:tr>
       <w:tr>
         <w:trPr>
-          <w:trHeight w:val="617" w:hRule="auto"/>
+          <w:trHeight w:val="623" w:hRule="auto"/>
           <w:tblHeader/>
         </w:trPr>
         <w:tc>
@@ -4882,7 +4882,7 @@
       </w:tr>
       <w:tr>
         <w:trPr>
-          <w:trHeight w:val="617" w:hRule="auto"/>
+          <w:trHeight w:val="608" w:hRule="auto"/>
         </w:trPr>
         <w:tc>
           <w:tcPr>
@@ -5211,7 +5211,7 @@
       </w:tr>
       <w:tr>
         <w:trPr>
-          <w:trHeight w:val="617" w:hRule="auto"/>
+          <w:trHeight w:val="608" w:hRule="auto"/>
         </w:trPr>
         <w:tc>
           <w:tcPr>
@@ -5540,7 +5540,7 @@
       </w:tr>
       <w:tr>
         <w:trPr>
-          <w:trHeight w:val="617" w:hRule="auto"/>
+          <w:trHeight w:val="608" w:hRule="auto"/>
         </w:trPr>
         <w:tc>
           <w:tcPr>
@@ -5869,7 +5869,7 @@
       </w:tr>
       <w:tr>
         <w:trPr>
-          <w:trHeight w:val="617" w:hRule="auto"/>
+          <w:trHeight w:val="608" w:hRule="auto"/>
         </w:trPr>
         <w:tc>
           <w:tcPr>
@@ -6198,7 +6198,7 @@
       </w:tr>
       <w:tr>
         <w:trPr>
-          <w:trHeight w:val="617" w:hRule="auto"/>
+          <w:trHeight w:val="608" w:hRule="auto"/>
         </w:trPr>
         <w:tc>
           <w:tcPr>
@@ -6527,7 +6527,7 @@
       </w:tr>
       <w:tr>
         <w:trPr>
-          <w:trHeight w:val="617" w:hRule="auto"/>
+          <w:trHeight w:val="608" w:hRule="auto"/>
         </w:trPr>
         <w:tc>
           <w:tcPr>
@@ -6856,7 +6856,7 @@
       </w:tr>
       <w:tr>
         <w:trPr>
-          <w:trHeight w:val="617" w:hRule="auto"/>
+          <w:trHeight w:val="608" w:hRule="auto"/>
         </w:trPr>
         <w:tc>
           <w:tcPr>
@@ -7185,7 +7185,7 @@
       </w:tr>
       <w:tr>
         <w:trPr>
-          <w:trHeight w:val="617" w:hRule="auto"/>
+          <w:trHeight w:val="608" w:hRule="auto"/>
         </w:trPr>
         <w:tc>
           <w:tcPr>
@@ -7514,7 +7514,7 @@
       </w:tr>
       <w:tr>
         <w:trPr>
-          <w:trHeight w:val="617" w:hRule="auto"/>
+          <w:trHeight w:val="608" w:hRule="auto"/>
         </w:trPr>
         <w:tc>
           <w:tcPr>
@@ -7843,7 +7843,7 @@
       </w:tr>
       <w:tr>
         <w:trPr>
-          <w:trHeight w:val="617" w:hRule="auto"/>
+          <w:trHeight w:val="608" w:hRule="auto"/>
         </w:trPr>
         <w:tc>
           <w:tcPr>
@@ -8172,7 +8172,7 @@
       </w:tr>
       <w:tr>
         <w:trPr>
-          <w:trHeight w:val="617" w:hRule="auto"/>
+          <w:trHeight w:val="608" w:hRule="auto"/>
         </w:trPr>
         <w:tc>
           <w:tcPr>
@@ -8501,7 +8501,7 @@
       </w:tr>
       <w:tr>
         <w:trPr>
-          <w:trHeight w:val="617" w:hRule="auto"/>
+          <w:trHeight w:val="623" w:hRule="auto"/>
         </w:trPr>
         <w:tc>
           <w:tcPr>
@@ -8865,7 +8865,7 @@
       </w:tblGrid>
       <w:tr>
         <w:trPr>
-          <w:trHeight w:val="574" w:hRule="auto"/>
+          <w:trHeight w:val="623" w:hRule="auto"/>
           <w:tblHeader/>
         </w:trPr>
         <w:tc>
@@ -8981,7 +8981,7 @@
       </w:tr>
       <w:tr>
         <w:trPr>
-          <w:trHeight w:val="574" w:hRule="auto"/>
+          <w:trHeight w:val="623" w:hRule="auto"/>
           <w:tblHeader/>
         </w:trPr>
         <w:tc>
@@ -9311,7 +9311,7 @@
       </w:tr>
       <w:tr>
         <w:trPr>
-          <w:trHeight w:val="571" w:hRule="auto"/>
+          <w:trHeight w:val="608" w:hRule="auto"/>
         </w:trPr>
         <w:tc>
           <w:tcPr>
@@ -9640,7 +9640,7 @@
       </w:tr>
       <w:tr>
         <w:trPr>
-          <w:trHeight w:val="612" w:hRule="auto"/>
+          <w:trHeight w:val="623" w:hRule="auto"/>
         </w:trPr>
         <w:tc>
           <w:tcPr>
@@ -9994,7 +9994,7 @@
       </w:tblGrid>
       <w:tr>
         <w:trPr>
-          <w:trHeight w:val="617" w:hRule="auto"/>
+          <w:trHeight w:val="623" w:hRule="auto"/>
           <w:tblHeader/>
         </w:trPr>
         <w:tc>
@@ -10165,7 +10165,7 @@
       </w:tr>
       <w:tr>
         <w:trPr>
-          <w:trHeight w:val="617" w:hRule="auto"/>
+          <w:trHeight w:val="623" w:hRule="auto"/>
           <w:tblHeader/>
         </w:trPr>
         <w:tc>
@@ -10495,7 +10495,7 @@
       </w:tr>
       <w:tr>
         <w:trPr>
-          <w:trHeight w:val="617" w:hRule="auto"/>
+          <w:trHeight w:val="608" w:hRule="auto"/>
         </w:trPr>
         <w:tc>
           <w:tcPr>
@@ -10824,7 +10824,7 @@
       </w:tr>
       <w:tr>
         <w:trPr>
-          <w:trHeight w:val="617" w:hRule="auto"/>
+          <w:trHeight w:val="608" w:hRule="auto"/>
         </w:trPr>
         <w:tc>
           <w:tcPr>
@@ -11153,7 +11153,7 @@
       </w:tr>
       <w:tr>
         <w:trPr>
-          <w:trHeight w:val="617" w:hRule="auto"/>
+          <w:trHeight w:val="608" w:hRule="auto"/>
         </w:trPr>
         <w:tc>
           <w:tcPr>
@@ -11482,7 +11482,7 @@
       </w:tr>
       <w:tr>
         <w:trPr>
-          <w:trHeight w:val="617" w:hRule="auto"/>
+          <w:trHeight w:val="608" w:hRule="auto"/>
         </w:trPr>
         <w:tc>
           <w:tcPr>
@@ -11811,7 +11811,7 @@
       </w:tr>
       <w:tr>
         <w:trPr>
-          <w:trHeight w:val="617" w:hRule="auto"/>
+          <w:trHeight w:val="608" w:hRule="auto"/>
         </w:trPr>
         <w:tc>
           <w:tcPr>
@@ -12140,7 +12140,7 @@
       </w:tr>
       <w:tr>
         <w:trPr>
-          <w:trHeight w:val="617" w:hRule="auto"/>
+          <w:trHeight w:val="608" w:hRule="auto"/>
         </w:trPr>
         <w:tc>
           <w:tcPr>
@@ -12469,7 +12469,7 @@
       </w:tr>
       <w:tr>
         <w:trPr>
-          <w:trHeight w:val="617" w:hRule="auto"/>
+          <w:trHeight w:val="608" w:hRule="auto"/>
         </w:trPr>
         <w:tc>
           <w:tcPr>
@@ -12798,7 +12798,7 @@
       </w:tr>
       <w:tr>
         <w:trPr>
-          <w:trHeight w:val="617" w:hRule="auto"/>
+          <w:trHeight w:val="623" w:hRule="auto"/>
         </w:trPr>
         <w:tc>
           <w:tcPr>
@@ -13162,7 +13162,7 @@
       </w:tblGrid>
       <w:tr>
         <w:trPr>
-          <w:trHeight w:val="574" w:hRule="auto"/>
+          <w:trHeight w:val="623" w:hRule="auto"/>
           <w:tblHeader/>
         </w:trPr>
         <w:tc>
@@ -13278,7 +13278,7 @@
       </w:tr>
       <w:tr>
         <w:trPr>
-          <w:trHeight w:val="574" w:hRule="auto"/>
+          <w:trHeight w:val="623" w:hRule="auto"/>
           <w:tblHeader/>
         </w:trPr>
         <w:tc>
@@ -13608,7 +13608,7 @@
       </w:tr>
       <w:tr>
         <w:trPr>
-          <w:trHeight w:val="572" w:hRule="auto"/>
+          <w:trHeight w:val="608" w:hRule="auto"/>
         </w:trPr>
         <w:tc>
           <w:tcPr>
@@ -13937,7 +13937,7 @@
       </w:tr>
       <w:tr>
         <w:trPr>
-          <w:trHeight w:val="571" w:hRule="auto"/>
+          <w:trHeight w:val="623" w:hRule="auto"/>
         </w:trPr>
         <w:tc>
           <w:tcPr>
@@ -14291,7 +14291,7 @@
       </w:tblGrid>
       <w:tr>
         <w:trPr>
-          <w:trHeight w:val="617" w:hRule="auto"/>
+          <w:trHeight w:val="623" w:hRule="auto"/>
           <w:tblHeader/>
         </w:trPr>
         <w:tc>
@@ -14462,7 +14462,7 @@
       </w:tr>
       <w:tr>
         <w:trPr>
-          <w:trHeight w:val="617" w:hRule="auto"/>
+          <w:trHeight w:val="623" w:hRule="auto"/>
           <w:tblHeader/>
         </w:trPr>
         <w:tc>
@@ -14792,7 +14792,7 @@
       </w:tr>
       <w:tr>
         <w:trPr>
-          <w:trHeight w:val="617" w:hRule="auto"/>
+          <w:trHeight w:val="608" w:hRule="auto"/>
         </w:trPr>
         <w:tc>
           <w:tcPr>
@@ -15121,7 +15121,7 @@
       </w:tr>
       <w:tr>
         <w:trPr>
-          <w:trHeight w:val="617" w:hRule="auto"/>
+          <w:trHeight w:val="608" w:hRule="auto"/>
         </w:trPr>
         <w:tc>
           <w:tcPr>
@@ -15450,7 +15450,7 @@
       </w:tr>
       <w:tr>
         <w:trPr>
-          <w:trHeight w:val="617" w:hRule="auto"/>
+          <w:trHeight w:val="608" w:hRule="auto"/>
         </w:trPr>
         <w:tc>
           <w:tcPr>
@@ -15779,7 +15779,7 @@
       </w:tr>
       <w:tr>
         <w:trPr>
-          <w:trHeight w:val="617" w:hRule="auto"/>
+          <w:trHeight w:val="608" w:hRule="auto"/>
         </w:trPr>
         <w:tc>
           <w:tcPr>
@@ -16108,7 +16108,7 @@
       </w:tr>
       <w:tr>
         <w:trPr>
-          <w:trHeight w:val="617" w:hRule="auto"/>
+          <w:trHeight w:val="608" w:hRule="auto"/>
         </w:trPr>
         <w:tc>
           <w:tcPr>
@@ -16437,7 +16437,7 @@
       </w:tr>
       <w:tr>
         <w:trPr>
-          <w:trHeight w:val="617" w:hRule="auto"/>
+          <w:trHeight w:val="608" w:hRule="auto"/>
         </w:trPr>
         <w:tc>
           <w:tcPr>
@@ -16766,7 +16766,7 @@
       </w:tr>
       <w:tr>
         <w:trPr>
-          <w:trHeight w:val="617" w:hRule="auto"/>
+          <w:trHeight w:val="608" w:hRule="auto"/>
         </w:trPr>
         <w:tc>
           <w:tcPr>
@@ -17095,7 +17095,7 @@
       </w:tr>
       <w:tr>
         <w:trPr>
-          <w:trHeight w:val="617" w:hRule="auto"/>
+          <w:trHeight w:val="623" w:hRule="auto"/>
         </w:trPr>
         <w:tc>
           <w:tcPr>
@@ -17459,7 +17459,7 @@
       </w:tblGrid>
       <w:tr>
         <w:trPr>
-          <w:trHeight w:val="574" w:hRule="auto"/>
+          <w:trHeight w:val="623" w:hRule="auto"/>
           <w:tblHeader/>
         </w:trPr>
         <w:tc>
@@ -17575,7 +17575,7 @@
       </w:tr>
       <w:tr>
         <w:trPr>
-          <w:trHeight w:val="574" w:hRule="auto"/>
+          <w:trHeight w:val="623" w:hRule="auto"/>
           <w:tblHeader/>
         </w:trPr>
         <w:tc>
@@ -17905,7 +17905,7 @@
       </w:tr>
       <w:tr>
         <w:trPr>
-          <w:trHeight w:val="572" w:hRule="auto"/>
+          <w:trHeight w:val="608" w:hRule="auto"/>
         </w:trPr>
         <w:tc>
           <w:tcPr>
@@ -18234,7 +18234,7 @@
       </w:tr>
       <w:tr>
         <w:trPr>
-          <w:trHeight w:val="572" w:hRule="auto"/>
+          <w:trHeight w:val="623" w:hRule="auto"/>
         </w:trPr>
         <w:tc>
           <w:tcPr>
@@ -18588,7 +18588,7 @@
       </w:tblGrid>
       <w:tr>
         <w:trPr>
-          <w:trHeight w:val="617" w:hRule="auto"/>
+          <w:trHeight w:val="623" w:hRule="auto"/>
           <w:tblHeader/>
         </w:trPr>
         <w:tc>
@@ -18759,7 +18759,7 @@
       </w:tr>
       <w:tr>
         <w:trPr>
-          <w:trHeight w:val="617" w:hRule="auto"/>
+          <w:trHeight w:val="623" w:hRule="auto"/>
           <w:tblHeader/>
         </w:trPr>
         <w:tc>
@@ -19089,7 +19089,7 @@
       </w:tr>
       <w:tr>
         <w:trPr>
-          <w:trHeight w:val="617" w:hRule="auto"/>
+          <w:trHeight w:val="608" w:hRule="auto"/>
         </w:trPr>
         <w:tc>
           <w:tcPr>
@@ -19418,7 +19418,7 @@
       </w:tr>
       <w:tr>
         <w:trPr>
-          <w:trHeight w:val="617" w:hRule="auto"/>
+          <w:trHeight w:val="608" w:hRule="auto"/>
         </w:trPr>
         <w:tc>
           <w:tcPr>
@@ -19747,7 +19747,7 @@
       </w:tr>
       <w:tr>
         <w:trPr>
-          <w:trHeight w:val="617" w:hRule="auto"/>
+          <w:trHeight w:val="608" w:hRule="auto"/>
         </w:trPr>
         <w:tc>
           <w:tcPr>
@@ -20076,7 +20076,7 @@
       </w:tr>
       <w:tr>
         <w:trPr>
-          <w:trHeight w:val="617" w:hRule="auto"/>
+          <w:trHeight w:val="608" w:hRule="auto"/>
         </w:trPr>
         <w:tc>
           <w:tcPr>
@@ -20405,7 +20405,7 @@
       </w:tr>
       <w:tr>
         <w:trPr>
-          <w:trHeight w:val="617" w:hRule="auto"/>
+          <w:trHeight w:val="608" w:hRule="auto"/>
         </w:trPr>
         <w:tc>
           <w:tcPr>
@@ -20734,7 +20734,7 @@
       </w:tr>
       <w:tr>
         <w:trPr>
-          <w:trHeight w:val="617" w:hRule="auto"/>
+          <w:trHeight w:val="608" w:hRule="auto"/>
         </w:trPr>
         <w:tc>
           <w:tcPr>
@@ -21063,7 +21063,7 @@
       </w:tr>
       <w:tr>
         <w:trPr>
-          <w:trHeight w:val="617" w:hRule="auto"/>
+          <w:trHeight w:val="608" w:hRule="auto"/>
         </w:trPr>
         <w:tc>
           <w:tcPr>
@@ -21392,7 +21392,7 @@
       </w:tr>
       <w:tr>
         <w:trPr>
-          <w:trHeight w:val="617" w:hRule="auto"/>
+          <w:trHeight w:val="623" w:hRule="auto"/>
         </w:trPr>
         <w:tc>
           <w:tcPr>
@@ -21756,7 +21756,7 @@
       </w:tblGrid>
       <w:tr>
         <w:trPr>
-          <w:trHeight w:val="574" w:hRule="auto"/>
+          <w:trHeight w:val="623" w:hRule="auto"/>
           <w:tblHeader/>
         </w:trPr>
         <w:tc>
@@ -21872,7 +21872,7 @@
       </w:tr>
       <w:tr>
         <w:trPr>
-          <w:trHeight w:val="574" w:hRule="auto"/>
+          <w:trHeight w:val="623" w:hRule="auto"/>
           <w:tblHeader/>
         </w:trPr>
         <w:tc>
@@ -22202,7 +22202,7 @@
       </w:tr>
       <w:tr>
         <w:trPr>
-          <w:trHeight w:val="572" w:hRule="auto"/>
+          <w:trHeight w:val="608" w:hRule="auto"/>
         </w:trPr>
         <w:tc>
           <w:tcPr>
@@ -22531,7 +22531,7 @@
       </w:tr>
       <w:tr>
         <w:trPr>
-          <w:trHeight w:val="572" w:hRule="auto"/>
+          <w:trHeight w:val="623" w:hRule="auto"/>
         </w:trPr>
         <w:tc>
           <w:tcPr>
@@ -22885,7 +22885,7 @@
       </w:tblGrid>
       <w:tr>
         <w:trPr>
-          <w:trHeight w:val="617" w:hRule="auto"/>
+          <w:trHeight w:val="623" w:hRule="auto"/>
           <w:tblHeader/>
         </w:trPr>
         <w:tc>
@@ -23056,7 +23056,7 @@
       </w:tr>
       <w:tr>
         <w:trPr>
-          <w:trHeight w:val="617" w:hRule="auto"/>
+          <w:trHeight w:val="623" w:hRule="auto"/>
           <w:tblHeader/>
         </w:trPr>
         <w:tc>
@@ -23386,7 +23386,7 @@
       </w:tr>
       <w:tr>
         <w:trPr>
-          <w:trHeight w:val="617" w:hRule="auto"/>
+          <w:trHeight w:val="608" w:hRule="auto"/>
         </w:trPr>
         <w:tc>
           <w:tcPr>
@@ -23715,7 +23715,7 @@
       </w:tr>
       <w:tr>
         <w:trPr>
-          <w:trHeight w:val="617" w:hRule="auto"/>
+          <w:trHeight w:val="608" w:hRule="auto"/>
         </w:trPr>
         <w:tc>
           <w:tcPr>
@@ -24044,7 +24044,7 @@
       </w:tr>
       <w:tr>
         <w:trPr>
-          <w:trHeight w:val="617" w:hRule="auto"/>
+          <w:trHeight w:val="608" w:hRule="auto"/>
         </w:trPr>
         <w:tc>
           <w:tcPr>
@@ -24373,7 +24373,7 @@
       </w:tr>
       <w:tr>
         <w:trPr>
-          <w:trHeight w:val="617" w:hRule="auto"/>
+          <w:trHeight w:val="608" w:hRule="auto"/>
         </w:trPr>
         <w:tc>
           <w:tcPr>
@@ -24702,7 +24702,7 @@
       </w:tr>
       <w:tr>
         <w:trPr>
-          <w:trHeight w:val="617" w:hRule="auto"/>
+          <w:trHeight w:val="608" w:hRule="auto"/>
         </w:trPr>
         <w:tc>
           <w:tcPr>
@@ -25031,7 +25031,7 @@
       </w:tr>
       <w:tr>
         <w:trPr>
-          <w:trHeight w:val="617" w:hRule="auto"/>
+          <w:trHeight w:val="623" w:hRule="auto"/>
         </w:trPr>
         <w:tc>
           <w:tcPr>
@@ -25395,7 +25395,7 @@
       </w:tblGrid>
       <w:tr>
         <w:trPr>
-          <w:trHeight w:val="574" w:hRule="auto"/>
+          <w:trHeight w:val="623" w:hRule="auto"/>
           <w:tblHeader/>
         </w:trPr>
         <w:tc>
@@ -25511,7 +25511,7 @@
       </w:tr>
       <w:tr>
         <w:trPr>
-          <w:trHeight w:val="574" w:hRule="auto"/>
+          <w:trHeight w:val="623" w:hRule="auto"/>
           <w:tblHeader/>
         </w:trPr>
         <w:tc>
@@ -25841,7 +25841,7 @@
       </w:tr>
       <w:tr>
         <w:trPr>
-          <w:trHeight w:val="572" w:hRule="auto"/>
+          <w:trHeight w:val="623" w:hRule="auto"/>
         </w:trPr>
         <w:tc>
           <w:tcPr>
@@ -26195,7 +26195,7 @@
       </w:tblGrid>
       <w:tr>
         <w:trPr>
-          <w:trHeight w:val="617" w:hRule="auto"/>
+          <w:trHeight w:val="623" w:hRule="auto"/>
           <w:tblHeader/>
         </w:trPr>
         <w:tc>
@@ -26366,7 +26366,7 @@
       </w:tr>
       <w:tr>
         <w:trPr>
-          <w:trHeight w:val="617" w:hRule="auto"/>
+          <w:trHeight w:val="623" w:hRule="auto"/>
           <w:tblHeader/>
         </w:trPr>
         <w:tc>
@@ -26696,7 +26696,7 @@
       </w:tr>
       <w:tr>
         <w:trPr>
-          <w:trHeight w:val="617" w:hRule="auto"/>
+          <w:trHeight w:val="608" w:hRule="auto"/>
         </w:trPr>
         <w:tc>
           <w:tcPr>
@@ -27025,7 +27025,7 @@
       </w:tr>
       <w:tr>
         <w:trPr>
-          <w:trHeight w:val="617" w:hRule="auto"/>
+          <w:trHeight w:val="608" w:hRule="auto"/>
         </w:trPr>
         <w:tc>
           <w:tcPr>
@@ -27354,7 +27354,7 @@
       </w:tr>
       <w:tr>
         <w:trPr>
-          <w:trHeight w:val="617" w:hRule="auto"/>
+          <w:trHeight w:val="608" w:hRule="auto"/>
         </w:trPr>
         <w:tc>
           <w:tcPr>
@@ -27683,7 +27683,7 @@
       </w:tr>
       <w:tr>
         <w:trPr>
-          <w:trHeight w:val="617" w:hRule="auto"/>
+          <w:trHeight w:val="608" w:hRule="auto"/>
         </w:trPr>
         <w:tc>
           <w:tcPr>
@@ -28012,7 +28012,7 @@
       </w:tr>
       <w:tr>
         <w:trPr>
-          <w:trHeight w:val="617" w:hRule="auto"/>
+          <w:trHeight w:val="608" w:hRule="auto"/>
         </w:trPr>
         <w:tc>
           <w:tcPr>
@@ -28341,7 +28341,7 @@
       </w:tr>
       <w:tr>
         <w:trPr>
-          <w:trHeight w:val="617" w:hRule="auto"/>
+          <w:trHeight w:val="608" w:hRule="auto"/>
         </w:trPr>
         <w:tc>
           <w:tcPr>
@@ -28670,7 +28670,7 @@
       </w:tr>
       <w:tr>
         <w:trPr>
-          <w:trHeight w:val="617" w:hRule="auto"/>
+          <w:trHeight w:val="608" w:hRule="auto"/>
         </w:trPr>
         <w:tc>
           <w:tcPr>
@@ -28999,7 +28999,7 @@
       </w:tr>
       <w:tr>
         <w:trPr>
-          <w:trHeight w:val="617" w:hRule="auto"/>
+          <w:trHeight w:val="608" w:hRule="auto"/>
         </w:trPr>
         <w:tc>
           <w:tcPr>
@@ -29328,7 +29328,7 @@
       </w:tr>
       <w:tr>
         <w:trPr>
-          <w:trHeight w:val="617" w:hRule="auto"/>
+          <w:trHeight w:val="608" w:hRule="auto"/>
         </w:trPr>
         <w:tc>
           <w:tcPr>
@@ -29657,7 +29657,7 @@
       </w:tr>
       <w:tr>
         <w:trPr>
-          <w:trHeight w:val="617" w:hRule="auto"/>
+          <w:trHeight w:val="608" w:hRule="auto"/>
         </w:trPr>
         <w:tc>
           <w:tcPr>
@@ -29986,7 +29986,7 @@
       </w:tr>
       <w:tr>
         <w:trPr>
-          <w:trHeight w:val="617" w:hRule="auto"/>
+          <w:trHeight w:val="623" w:hRule="auto"/>
         </w:trPr>
         <w:tc>
           <w:tcPr>
@@ -30350,7 +30350,7 @@
       </w:tblGrid>
       <w:tr>
         <w:trPr>
-          <w:trHeight w:val="574" w:hRule="auto"/>
+          <w:trHeight w:val="623" w:hRule="auto"/>
           <w:tblHeader/>
         </w:trPr>
         <w:tc>
@@ -30466,7 +30466,7 @@
       </w:tr>
       <w:tr>
         <w:trPr>
-          <w:trHeight w:val="574" w:hRule="auto"/>
+          <w:trHeight w:val="623" w:hRule="auto"/>
           <w:tblHeader/>
         </w:trPr>
         <w:tc>
@@ -30796,7 +30796,7 @@
       </w:tr>
       <w:tr>
         <w:trPr>
-          <w:trHeight w:val="572" w:hRule="auto"/>
+          <w:trHeight w:val="608" w:hRule="auto"/>
         </w:trPr>
         <w:tc>
           <w:tcPr>
@@ -31125,7 +31125,7 @@
       </w:tr>
       <w:tr>
         <w:trPr>
-          <w:trHeight w:val="571" w:hRule="auto"/>
+          <w:trHeight w:val="608" w:hRule="auto"/>
         </w:trPr>
         <w:tc>
           <w:tcPr>
@@ -31454,7 +31454,7 @@
       </w:tr>
       <w:tr>
         <w:trPr>
-          <w:trHeight w:val="571" w:hRule="auto"/>
+          <w:trHeight w:val="608" w:hRule="auto"/>
         </w:trPr>
         <w:tc>
           <w:tcPr>
@@ -31783,7 +31783,7 @@
       </w:tr>
       <w:tr>
         <w:trPr>
-          <w:trHeight w:val="571" w:hRule="auto"/>
+          <w:trHeight w:val="608" w:hRule="auto"/>
         </w:trPr>
         <w:tc>
           <w:tcPr>
@@ -32112,7 +32112,7 @@
       </w:tr>
       <w:tr>
         <w:trPr>
-          <w:trHeight w:val="572" w:hRule="auto"/>
+          <w:trHeight w:val="623" w:hRule="auto"/>
         </w:trPr>
         <w:tc>
           <w:tcPr>
@@ -32466,7 +32466,7 @@
       </w:tblGrid>
       <w:tr>
         <w:trPr>
-          <w:trHeight w:val="617" w:hRule="auto"/>
+          <w:trHeight w:val="623" w:hRule="auto"/>
           <w:tblHeader/>
         </w:trPr>
         <w:tc>
@@ -32637,7 +32637,7 @@
       </w:tr>
       <w:tr>
         <w:trPr>
-          <w:trHeight w:val="617" w:hRule="auto"/>
+          <w:trHeight w:val="623" w:hRule="auto"/>
           <w:tblHeader/>
         </w:trPr>
         <w:tc>
@@ -32967,7 +32967,7 @@
       </w:tr>
       <w:tr>
         <w:trPr>
-          <w:trHeight w:val="617" w:hRule="auto"/>
+          <w:trHeight w:val="608" w:hRule="auto"/>
         </w:trPr>
         <w:tc>
           <w:tcPr>
@@ -33296,7 +33296,7 @@
       </w:tr>
       <w:tr>
         <w:trPr>
-          <w:trHeight w:val="617" w:hRule="auto"/>
+          <w:trHeight w:val="608" w:hRule="auto"/>
         </w:trPr>
         <w:tc>
           <w:tcPr>
@@ -33625,7 +33625,7 @@
       </w:tr>
       <w:tr>
         <w:trPr>
-          <w:trHeight w:val="617" w:hRule="auto"/>
+          <w:trHeight w:val="608" w:hRule="auto"/>
         </w:trPr>
         <w:tc>
           <w:tcPr>
@@ -33954,7 +33954,7 @@
       </w:tr>
       <w:tr>
         <w:trPr>
-          <w:trHeight w:val="617" w:hRule="auto"/>
+          <w:trHeight w:val="608" w:hRule="auto"/>
         </w:trPr>
         <w:tc>
           <w:tcPr>
@@ -34283,7 +34283,7 @@
       </w:tr>
       <w:tr>
         <w:trPr>
-          <w:trHeight w:val="617" w:hRule="auto"/>
+          <w:trHeight w:val="608" w:hRule="auto"/>
         </w:trPr>
         <w:tc>
           <w:tcPr>
@@ -34612,7 +34612,7 @@
       </w:tr>
       <w:tr>
         <w:trPr>
-          <w:trHeight w:val="617" w:hRule="auto"/>
+          <w:trHeight w:val="608" w:hRule="auto"/>
         </w:trPr>
         <w:tc>
           <w:tcPr>
@@ -34941,7 +34941,7 @@
       </w:tr>
       <w:tr>
         <w:trPr>
-          <w:trHeight w:val="617" w:hRule="auto"/>
+          <w:trHeight w:val="608" w:hRule="auto"/>
         </w:trPr>
         <w:tc>
           <w:tcPr>
@@ -35270,7 +35270,7 @@
       </w:tr>
       <w:tr>
         <w:trPr>
-          <w:trHeight w:val="617" w:hRule="auto"/>
+          <w:trHeight w:val="608" w:hRule="auto"/>
         </w:trPr>
         <w:tc>
           <w:tcPr>
@@ -35599,7 +35599,7 @@
       </w:tr>
       <w:tr>
         <w:trPr>
-          <w:trHeight w:val="617" w:hRule="auto"/>
+          <w:trHeight w:val="608" w:hRule="auto"/>
         </w:trPr>
         <w:tc>
           <w:tcPr>
@@ -35928,7 +35928,7 @@
       </w:tr>
       <w:tr>
         <w:trPr>
-          <w:trHeight w:val="617" w:hRule="auto"/>
+          <w:trHeight w:val="608" w:hRule="auto"/>
         </w:trPr>
         <w:tc>
           <w:tcPr>
@@ -36257,7 +36257,7 @@
       </w:tr>
       <w:tr>
         <w:trPr>
-          <w:trHeight w:val="617" w:hRule="auto"/>
+          <w:trHeight w:val="608" w:hRule="auto"/>
         </w:trPr>
         <w:tc>
           <w:tcPr>
@@ -36586,7 +36586,7 @@
       </w:tr>
       <w:tr>
         <w:trPr>
-          <w:trHeight w:val="617" w:hRule="auto"/>
+          <w:trHeight w:val="608" w:hRule="auto"/>
         </w:trPr>
         <w:tc>
           <w:tcPr>
@@ -36915,7 +36915,7 @@
       </w:tr>
       <w:tr>
         <w:trPr>
-          <w:trHeight w:val="617" w:hRule="auto"/>
+          <w:trHeight w:val="608" w:hRule="auto"/>
         </w:trPr>
         <w:tc>
           <w:tcPr>
@@ -37244,7 +37244,7 @@
       </w:tr>
       <w:tr>
         <w:trPr>
-          <w:trHeight w:val="617" w:hRule="auto"/>
+          <w:trHeight w:val="608" w:hRule="auto"/>
         </w:trPr>
         <w:tc>
           <w:tcPr>
@@ -37573,7 +37573,7 @@
       </w:tr>
       <w:tr>
         <w:trPr>
-          <w:trHeight w:val="617" w:hRule="auto"/>
+          <w:trHeight w:val="608" w:hRule="auto"/>
         </w:trPr>
         <w:tc>
           <w:tcPr>
@@ -37902,7 +37902,7 @@
       </w:tr>
       <w:tr>
         <w:trPr>
-          <w:trHeight w:val="617" w:hRule="auto"/>
+          <w:trHeight w:val="623" w:hRule="auto"/>
         </w:trPr>
         <w:tc>
           <w:tcPr>

</xml_diff>